<commit_message>
Revise case study on the Optum Algorithm to enhance clarity and detail regarding racial bias and algorithmic impact on healthcare outcomes
</commit_message>
<xml_diff>
--- a/docs/cases/10-optum-algorithm.docx
+++ b/docs/cases/10-optum-algorithm.docx
@@ -391,7 +391,27 @@
         <w:pStyle w:val="BodyText"/>
       </w:pPr>
       <w:r>
-        <w:t xml:space="preserve">In the late 2010s, a research team led by Ziad Obermeyer got a chance almost no outside researchers ever get. Obermeyer had worked emergency rooms before turning to research; his collaborators included the economist Sendhil Mullainathan and the physician Brian Powers. At one large academic hospital, the team could see both halves of the picture at once: the algorithm’s scores,</w:t>
+        <w:t xml:space="preserve">The people who finally checked the number came at it from two directions. Ziad Obermeyer was an emergency physician before he was a researcher. Years of ER shifts had left him with a working obsession: medicine’s judgments — human or machine — are tested against messy reality, and they fail more often than anyone records. By the late 2010s he was a professor at Berkeley, studying what algorithms in medicine actually do. Sendhil Mullainathan, his longtime collaborator, was an economist — a MacArthur</w:t>
+      </w:r>
+      <w:r>
+        <w:t xml:space="preserve"> </w:t>
+      </w:r>
+      <w:r>
+        <w:t xml:space="preserve">“genius”</w:t>
+      </w:r>
+      <w:r>
+        <w:t xml:space="preserve"> </w:t>
+      </w:r>
+      <w:r>
+        <w:t xml:space="preserve">award winner who had spent a career studying human bias, and who saw algorithms as a new kind of evidence about it. With them were the physicians Brian Powers and Christine Vogeli.</w:t>
+      </w:r>
+    </w:p>
+    <w:p>
+      <w:pPr>
+        <w:pStyle w:val="BodyText"/>
+      </w:pPr>
+      <w:r>
+        <w:t xml:space="preserve">What the team got, at one large academic hospital, was a dataset that almost never exists. Companies guard their algorithms’ scores as trade secrets. Hospitals hold the medical records. The two are almost never in the same room — which is why claims about algorithmic bias usually end in a shrug, with no way to check. Here, for once, both halves sat side by side: the machine’s ranking,</w:t>
       </w:r>
       <w:r>
         <w:t xml:space="preserve"> </w:t>
@@ -407,7 +427,7 @@
         <w:t xml:space="preserve"> </w:t>
       </w:r>
       <w:r>
-        <w:t xml:space="preserve">the patients’ actual medical records. They could check the machine’s ranking against the truth.</w:t>
+        <w:t xml:space="preserve">the truth it was supposed to track.</w:t>
       </w:r>
     </w:p>
     <w:p>
@@ -455,7 +475,7 @@
         <w:t xml:space="preserve"> </w:t>
       </w:r>
       <w:r>
-        <w:t xml:space="preserve">than white patients — more uncontrolled diabetes, more high blood pressure, more kidney disease, more anemia</w:t>
+        <w:t xml:space="preserve">than white patients</w:t>
       </w:r>
       <w:r>
         <w:t xml:space="preserve"> </w:t>
@@ -475,7 +495,7 @@
         <w:t xml:space="preserve">)</w:t>
       </w:r>
       <w:r>
-        <w:t xml:space="preserve">. The algorithm was telling care managers that these patients were equally needy. The medical records said otherwise.</w:t>
+        <w:t xml:space="preserve">. And the gap was not just a count of diagnoses. It showed up in the lab values themselves: at the same score, Black patients had higher blood sugar, higher blood pressure, worse kidney function, more severe anemia. These were not borderline cases sorted slightly differently. These were sicker bodies, scored as if they were healthier ones. The algorithm was telling care managers the two groups were equally needy. The blood work said otherwise.</w:t>
       </w:r>
     </w:p>
     <w:p>

</xml_diff>